<commit_message>
Generalize model name references in Stage 2 and 3b text
</commit_message>
<xml_diff>
--- a/blog_draft_2.docx
+++ b/blog_draft_2.docx
@@ -420,7 +420,7 @@
         <w:rPr>
           <w:rStyle w:val="VerbatimChar"/>
         </w:rPr>
-        <w:t xml:space="preserve">    T["Trim Video&lt;br&gt;&lt;i&gt;YOLO11x + Pose&lt;/i&gt;"]:::prep --&gt; S["Stabilize Video&lt;br&gt;&lt;i&gt;Grounding DINO + SAM 2&lt;/i&gt;"]:::prep</w:t>
+        <w:t xml:space="preserve">    T["Trim Video&lt;br&gt;&lt;i&gt;Pose Detection&lt;/i&gt;"]:::prep --&gt; S["Stabilize Video&lt;br&gt;&lt;i&gt;Crease Line Tracking&lt;/i&gt;"]:::prep</w:t>
       </w:r>
       <w:r>
         <w:br/>
@@ -438,7 +438,7 @@
         <w:rPr>
           <w:rStyle w:val="VerbatimChar"/>
         </w:rPr>
-        <w:t xml:space="preserve">    S -- "Stable Frames" --&gt; D["Depth Maps&lt;br&gt;&lt;i&gt;Depth Anything V2&lt;/i&gt;"]:::infer</w:t>
+        <w:t xml:space="preserve">    S -- "Stable Frames" --&gt; D["Depth Maps&lt;br&gt;&lt;i&gt;Depth Estimation&lt;/i&gt;"]:::infer</w:t>
       </w:r>
       <w:r>
         <w:br/>
@@ -447,7 +447,7 @@
         <w:rPr>
           <w:rStyle w:val="VerbatimChar"/>
         </w:rPr>
-        <w:t xml:space="preserve">    S -- "Stable Frames" --&gt; Seg["Bat Mask&lt;br&gt;&lt;i&gt;SAM 3.1&lt;/i&gt;"]:::infer</w:t>
+        <w:t xml:space="preserve">    S -- "Stable Frames" --&gt; Seg["Bat Mask&lt;br&gt;&lt;i&gt;Object Tracking&lt;/i&gt;"]:::infer</w:t>
       </w:r>
       <w:r>
         <w:br/>
@@ -492,7 +492,7 @@
         <w:rPr>
           <w:rStyle w:val="VerbatimChar"/>
         </w:rPr>
-        <w:t xml:space="preserve">    K -- "Raw 3D Points" --&gt; F["3D Fusion&lt;br&gt;&lt;i&gt;Kalman RTS&lt;/i&gt;"]:::phys</w:t>
+        <w:t xml:space="preserve">    K -- "Raw 3D Points" --&gt; F["3D Fusion&lt;br&gt;&lt;i&gt;Physics-based Smoothing&lt;/i&gt;"]:::phys</w:t>
       </w:r>
       <w:r>
         <w:br/>
@@ -510,7 +510,7 @@
         <w:rPr>
           <w:rStyle w:val="VerbatimChar"/>
         </w:rPr>
-        <w:t xml:space="preserve">    F == "Smooth Trajectory" === R["Render Bat Swing Plane&lt;br&gt;&lt;i&gt;Matplotlib + FFmpeg&lt;/i&gt;"]:::out</w:t>
+        <w:t xml:space="preserve">    F == "Smooth Trajectory" === R["Render Bat Swing Plane&lt;br&gt;&lt;i&gt;3D Visualization&lt;/i&gt;"]:::out</w:t>
       </w:r>
       <w:r>
         <w:br/>
@@ -603,7 +603,7 @@
         <w:t xml:space="preserve"> </w:t>
       </w:r>
       <w:r>
-        <w:t xml:space="preserve">*</w:t>
+        <w:t xml:space="preserve">* An</w:t>
       </w:r>
       <w:r>
         <w:t xml:space="preserve"> </w:t>
@@ -613,7 +613,7 @@
           <w:b/>
           <w:bCs/>
         </w:rPr>
-        <w:t xml:space="preserve">YOLO11x</w:t>
+        <w:t xml:space="preserve">object detection model</w:t>
       </w:r>
       <w:r>
         <w:t xml:space="preserve"> </w:t>
@@ -625,7 +625,7 @@
         <w:t xml:space="preserve"> </w:t>
       </w:r>
       <w:r>
-        <w:t xml:space="preserve">*</w:t>
+        <w:t xml:space="preserve">* A</w:t>
       </w:r>
       <w:r>
         <w:t xml:space="preserve"> </w:t>
@@ -635,7 +635,7 @@
           <w:b/>
           <w:bCs/>
         </w:rPr>
-        <w:t xml:space="preserve">YOLOv8x-Pose</w:t>
+        <w:t xml:space="preserve">pose estimation model</w:t>
       </w:r>
       <w:r>
         <w:t xml:space="preserve"> </w:t>
@@ -1621,7 +1621,7 @@
         <w:pStyle w:val="FirstParagraph"/>
       </w:pPr>
       <w:r>
-        <w:t xml:space="preserve">To find these lines without training a custom model, we use</w:t>
+        <w:t xml:space="preserve">To find these lines without training a custom model, we use a</w:t>
       </w:r>
       <w:r>
         <w:t xml:space="preserve"> </w:t>
@@ -1631,10 +1631,13 @@
           <w:b/>
           <w:bCs/>
         </w:rPr>
-        <w:t xml:space="preserve">Grounding DINO</w:t>
-      </w:r>
-      <w:r>
-        <w:t xml:space="preserve">-an object detection model that understands English. We feed it a simple text query:</w:t>
+        <w:t xml:space="preserve">text-to-object detection model</w:t>
+      </w:r>
+      <w:r>
+        <w:t xml:space="preserve"> </w:t>
+      </w:r>
+      <w:r>
+        <w:t xml:space="preserve">that understands English. We feed it a simple text query:</w:t>
       </w:r>
     </w:p>
     <w:p>
@@ -1653,7 +1656,7 @@
         <w:pStyle w:val="FirstParagraph"/>
       </w:pPr>
       <w:r>
-        <w:t xml:space="preserve">Even though Grounding DINO wasn’t trained specifically on cricket pitches, it locates the white lines on the ground. Once it finds them in a single</w:t>
+        <w:t xml:space="preserve">Even though this detection model wasn’t trained specifically on cricket pitches, it locates the white lines on the ground. Once it finds them in a single</w:t>
       </w:r>
       <w:r>
         <w:t xml:space="preserve"> </w:t>
@@ -1671,7 +1674,7 @@
         <w:t xml:space="preserve"> </w:t>
       </w:r>
       <w:r>
-        <w:t xml:space="preserve">we feed those locations into</w:t>
+        <w:t xml:space="preserve">we feed those locations into a</w:t>
       </w:r>
       <w:r>
         <w:t xml:space="preserve"> </w:t>
@@ -1681,13 +1684,10 @@
           <w:b/>
           <w:bCs/>
         </w:rPr>
-        <w:t xml:space="preserve">SAM 2</w:t>
-      </w:r>
-      <w:r>
-        <w:t xml:space="preserve"> </w:t>
-      </w:r>
-      <w:r>
-        <w:t xml:space="preserve">(Segment Anything Model 2). SAM 2 is designed for video; we give it a few points on the lines, and it automatically tracks and outlines the shapes of those crease lines forward and backward through the entire clip.</w:t>
+        <w:t xml:space="preserve">video object tracking model</w:t>
+      </w:r>
+      <w:r>
+        <w:t xml:space="preserve">. We give it a few points on the lines, and it automatically tracks and outlines the shapes of those crease lines forward and backward through the entire clip.</w:t>
       </w:r>
     </w:p>
     <w:p>
@@ -1723,7 +1723,7 @@
         <w:pStyle w:val="FirstParagraph"/>
       </w:pPr>
       <w:r>
-        <w:t xml:space="preserve">Once SAM 2 gives us the pixel coordinates of the left and right crease lines for every frame (</w:t>
+        <w:t xml:space="preserve">Once the tracking model gives us the pixel coordinates of the left and right crease lines for every frame (</w:t>
       </w:r>
       <w:r>
         <w:rPr>
@@ -2102,7 +2102,7 @@
         <w:pStyle w:val="BodyText"/>
       </w:pPr>
       <w:r>
-        <w:t xml:space="preserve">To recover this missing dimension, we use</w:t>
+        <w:t xml:space="preserve">To recover this missing dimension, we use a</w:t>
       </w:r>
       <w:r>
         <w:t xml:space="preserve"> </w:t>
@@ -2112,7 +2112,7 @@
           <w:b/>
           <w:bCs/>
         </w:rPr>
-        <w:t xml:space="preserve">Depth Anything V2 Large</w:t>
+        <w:t xml:space="preserve">depth estimation model</w:t>
       </w:r>
       <w:r>
         <w:t xml:space="preserve">, a state-of-the-art transformer trained on millions of images to predict relative depth. It doesn’t give us absolute distances in meters, but it calculates exactly which pixels are closer to the camera and which are farther away.</w:t>
@@ -2611,17 +2611,23 @@
         <w:pStyle w:val="BodyText"/>
       </w:pPr>
       <w:r>
+        <w:t xml:space="preserve">A</w:t>
+      </w:r>
+      <w:r>
+        <w:t xml:space="preserve"> </w:t>
+      </w:r>
+      <w:r>
         <w:rPr>
           <w:b/>
           <w:bCs/>
         </w:rPr>
-        <w:t xml:space="preserve">SAM 3.1 Multiplex</w:t>
-      </w:r>
-      <w:r>
-        <w:t xml:space="preserve"> </w:t>
-      </w:r>
-      <w:r>
-        <w:t xml:space="preserve">is a massive video segmentation model that can track objects across frames with remarkable consistency. You give it a text prompt like</w:t>
+        <w:t xml:space="preserve">video object segmentation model</w:t>
+      </w:r>
+      <w:r>
+        <w:t xml:space="preserve"> </w:t>
+      </w:r>
+      <w:r>
+        <w:t xml:space="preserve">can track objects across frames with remarkable consistency. You give it a text prompt like</w:t>
       </w:r>
       <w:r>
         <w:t xml:space="preserve"> </w:t>
@@ -2633,10 +2639,7 @@
         <w:t xml:space="preserve">"bat"</w:t>
       </w:r>
       <w:r>
-        <w:t xml:space="preserve"> </w:t>
-      </w:r>
-      <w:r>
-        <w:t xml:space="preserve">and it finds the bat in one frame and tracks it through the entire video.</w:t>
+        <w:t xml:space="preserve">, and it finds the bat in one frame and tracks it through the entire video.</w:t>
       </w:r>
     </w:p>
     <w:p>
@@ -2670,7 +2673,7 @@
         <w:t xml:space="preserve"> </w:t>
       </w:r>
       <w:r>
-        <w:t xml:space="preserve">SAM would confidently highlight the wicket stumps as well, treating them as if they were bats.</w:t>
+        <w:t xml:space="preserve">the tracking model would confidently highlight the wicket stumps as well, treating them as if they were bats.</w:t>
       </w:r>
     </w:p>
     <w:bookmarkStart w:id="35" w:name="the-dual-session-subtraction-trick"/>
@@ -2687,7 +2690,7 @@
         <w:pStyle w:val="FirstParagraph"/>
       </w:pPr>
       <w:r>
-        <w:t xml:space="preserve">The fix is to run SAM twice in two separate sessions, and then use logical subtraction to clean the masks.</w:t>
+        <w:t xml:space="preserve">The fix is to run the model twice in two separate sessions, and then use logical subtraction to clean the masks.</w:t>
       </w:r>
     </w:p>
     <w:p>
@@ -3442,7 +3445,7 @@
         <w:pStyle w:val="FirstParagraph"/>
       </w:pPr>
       <w:r>
-        <w:t xml:space="preserve">To solve this, we bring back</w:t>
+        <w:t xml:space="preserve">To solve this, we bring back the</w:t>
       </w:r>
       <w:r>
         <w:t xml:space="preserve"> </w:t>
@@ -3452,7 +3455,7 @@
           <w:b/>
           <w:bCs/>
         </w:rPr>
-        <w:t xml:space="preserve">YOLOv8-Pose</w:t>
+        <w:t xml:space="preserve">pose estimation model</w:t>
       </w:r>
       <w:r>
         <w:t xml:space="preserve">. We use it to detect the batsman’s wrists (COCO keypoints 9 and 10). We calculate the midpoint between the left and right wrists to find the player’s grip.</w:t>
@@ -6260,13 +6263,13 @@
         <w:t xml:space="preserve">No engineering project is complete without a list of things that broke along the way.</w:t>
       </w:r>
     </w:p>
-    <w:bookmarkStart w:id="50" w:name="sam-tracking-the-wrong-object"/>
+    <w:bookmarkStart w:id="50" w:name="tracking-the-wrong-object"/>
     <w:p>
       <w:pPr>
         <w:pStyle w:val="Heading3"/>
       </w:pPr>
       <w:r>
-        <w:t xml:space="preserve">SAM Tracking the Wrong Object</w:t>
+        <w:t xml:space="preserve">Tracking the Wrong Object</w:t>
       </w:r>
     </w:p>
     <w:p>
@@ -6274,7 +6277,7 @@
         <w:pStyle w:val="FirstParagraph"/>
       </w:pPr>
       <w:r>
-        <w:t xml:space="preserve">In early versions, SAM 3.1 locked onto the wicket stumps instead of the bat in ~20% of videos. The stumps and bat are both long, thin, wooden objects. The dual-session subtraction trick (Stage 3b) solved this completely.</w:t>
+        <w:t xml:space="preserve">In early versions, the video segmentation model locked onto the wicket stumps instead of the bat in ~20% of videos. The stumps and bat are both long, thin, wooden objects. The dual-session subtraction trick (Stage 3b) solved this completely.</w:t>
       </w:r>
     </w:p>
     <w:bookmarkEnd w:id="50"/>

</xml_diff>

<commit_message>
Remove video links from blog draft and set DOCX heading colors to black
</commit_message>
<xml_diff>
--- a/blog_draft_2.docx
+++ b/blog_draft_2.docx
@@ -2,7 +2,7 @@
 <file path=word/document.xml><?xml version="1.0" encoding="utf-8"?>
 <w:document xmlns:w="http://schemas.openxmlformats.org/wordprocessingml/2006/main" xmlns:m="http://schemas.openxmlformats.org/officeDocument/2006/math" xmlns:r="http://schemas.openxmlformats.org/officeDocument/2006/relationships" xmlns:o="urn:schemas-microsoft-com:office:office" xmlns:v="urn:schemas-microsoft-com:vml" xmlns:w10="urn:schemas-microsoft-com:office:word" xmlns:a="http://schemas.openxmlformats.org/drawingml/2006/main" xmlns:pic="http://schemas.openxmlformats.org/drawingml/2006/picture" xmlns:wp="http://schemas.openxmlformats.org/drawingml/2006/wordprocessingDrawing">
   <w:body>
-    <w:bookmarkStart w:id="56" w:name="X23f5f6e5cf9dc5e5fd06aa1f60de30f6aeb92ce"/>
+    <w:bookmarkStart w:id="49" w:name="X23f5f6e5cf9dc5e5fd06aa1f60de30f6aeb92ce"/>
     <w:p>
       <w:pPr>
         <w:pStyle w:val="Heading1"/>
@@ -35,20 +35,7 @@
         <w:pStyle w:val="FirstParagraph"/>
       </w:pPr>
     </w:p>
-    <w:p>
-      <w:pPr>
-        <w:pStyle w:val="BodyText"/>
-      </w:pPr>
-      <w:hyperlink r:id="rId20">
-        <w:r>
-          <w:rPr>
-            <w:rStyle w:val="Hyperlink"/>
-          </w:rPr>
-          <w:t xml:space="preserve">Watch the full 3D Swing Plane Video</w:t>
-        </w:r>
-      </w:hyperlink>
-    </w:p>
-    <w:bookmarkStart w:id="21" w:name="X66041c6dc78ae9159bcd46a489ffae9aa36d02a"/>
+    <w:bookmarkStart w:id="20" w:name="X66041c6dc78ae9159bcd46a489ffae9aa36d02a"/>
     <w:p>
       <w:pPr>
         <w:pStyle w:val="Heading2"/>
@@ -173,8 +160,8 @@
         </w:pict>
       </w:r>
     </w:p>
-    <w:bookmarkEnd w:id="21"/>
-    <w:bookmarkStart w:id="22" w:name="X75fc55bd7b3628a4a22a5b2ee633f8c329c107c"/>
+    <w:bookmarkEnd w:id="20"/>
+    <w:bookmarkStart w:id="21" w:name="X75fc55bd7b3628a4a22a5b2ee633f8c329c107c"/>
     <w:p>
       <w:pPr>
         <w:pStyle w:val="Heading2"/>
@@ -337,8 +324,8 @@
         </w:pict>
       </w:r>
     </w:p>
-    <w:bookmarkEnd w:id="22"/>
-    <w:bookmarkStart w:id="23" w:name="the-architecture-at-a-glance"/>
+    <w:bookmarkEnd w:id="21"/>
+    <w:bookmarkStart w:id="22" w:name="the-architecture-at-a-glance"/>
     <w:p>
       <w:pPr>
         <w:pStyle w:val="Heading2"/>
@@ -558,8 +545,8 @@
         </w:pict>
       </w:r>
     </w:p>
-    <w:bookmarkEnd w:id="23"/>
-    <w:bookmarkStart w:id="26" w:name="stage-1-isolating-the-active-swing"/>
+    <w:bookmarkEnd w:id="22"/>
+    <w:bookmarkStart w:id="25" w:name="stage-1-isolating-the-active-swing"/>
     <w:p>
       <w:pPr>
         <w:pStyle w:val="Heading2"/>
@@ -644,7 +631,7 @@
         <w:t xml:space="preserve">detects people and extracts their skeletal keypoints (like their wrists).</w:t>
       </w:r>
     </w:p>
-    <w:bookmarkStart w:id="24" w:name="tracing-the-batsman-match-scores"/>
+    <w:bookmarkStart w:id="23" w:name="tracing-the-batsman-match-scores"/>
     <w:p>
       <w:pPr>
         <w:pStyle w:val="Heading3"/>
@@ -775,8 +762,8 @@
         <w:t xml:space="preserve">Keeping track of who is on the left or right so we don’t swap identities when people pass each other.</w:t>
       </w:r>
     </w:p>
-    <w:bookmarkEnd w:id="24"/>
-    <w:bookmarkStart w:id="25" w:name="selecting-the-active-swinger-with-code"/>
+    <w:bookmarkEnd w:id="23"/>
+    <w:bookmarkStart w:id="24" w:name="selecting-the-active-swinger-with-code"/>
     <w:p>
       <w:pPr>
         <w:pStyle w:val="Heading3"/>
@@ -1564,9 +1551,9 @@
         </w:pict>
       </w:r>
     </w:p>
+    <w:bookmarkEnd w:id="24"/>
     <w:bookmarkEnd w:id="25"/>
-    <w:bookmarkEnd w:id="26"/>
-    <w:bookmarkStart w:id="31" w:name="X17eaa4f7b143b561c5063aa7b7b05110300b522"/>
+    <w:bookmarkStart w:id="28" w:name="X17eaa4f7b143b561c5063aa7b7b05110300b522"/>
     <w:p>
       <w:pPr>
         <w:pStyle w:val="Heading2"/>
@@ -1607,7 +1594,7 @@
         <w:t xml:space="preserve">Every pitch has two white crease lines painted on the ground (the bowling and batting creases). If we can locate these lines in every frame, we can warp the video so that the crease lines always sit in the exact same pixel positions.</w:t>
       </w:r>
     </w:p>
-    <w:bookmarkStart w:id="28" w:name="X14b169e0494e760fcf63057473f4c62881c27cd"/>
+    <w:bookmarkStart w:id="26" w:name="X14b169e0494e760fcf63057473f4c62881c27cd"/>
     <w:p>
       <w:pPr>
         <w:pStyle w:val="Heading3"/>
@@ -1695,27 +1682,323 @@
         <w:pStyle w:val="BodyText"/>
       </w:pPr>
     </w:p>
+    <w:bookmarkEnd w:id="26"/>
+    <w:bookmarkStart w:id="27" w:name="warping-the-coordinate-space"/>
+    <w:p>
+      <w:pPr>
+        <w:pStyle w:val="Heading3"/>
+      </w:pPr>
+      <w:r>
+        <w:t xml:space="preserve">Warping the Coordinate Space</w:t>
+      </w:r>
+    </w:p>
+    <w:p>
+      <w:pPr>
+        <w:pStyle w:val="FirstParagraph"/>
+      </w:pPr>
+      <w:r>
+        <w:t xml:space="preserve">Once the tracking model gives us the pixel coordinates of the left and right crease lines for every frame (</w:t>
+      </w:r>
+      <w:r>
+        <w:rPr>
+          <w:rStyle w:val="VerbatimChar"/>
+        </w:rPr>
+        <w:t xml:space="preserve">left_x</w:t>
+      </w:r>
+      <w:r>
+        <w:t xml:space="preserve"> </w:t>
+      </w:r>
+      <w:r>
+        <w:t xml:space="preserve">and</w:t>
+      </w:r>
+      <w:r>
+        <w:t xml:space="preserve"> </w:t>
+      </w:r>
+      <w:r>
+        <w:rPr>
+          <w:rStyle w:val="VerbatimChar"/>
+        </w:rPr>
+        <w:t xml:space="preserve">right_x</w:t>
+      </w:r>
+      <w:r>
+        <w:t xml:space="preserve">), we lock them in place using a geometric transformation.</w:t>
+      </w:r>
+    </w:p>
     <w:p>
       <w:pPr>
         <w:pStyle w:val="BodyText"/>
       </w:pPr>
-      <w:hyperlink r:id="rId27">
-        <w:r>
-          <w:rPr>
-            <w:rStyle w:val="Hyperlink"/>
-          </w:rPr>
-          <w:t xml:space="preserve">Watch the high-res Pitch Detection Bounding Box Video</w:t>
-        </w:r>
-      </w:hyperlink>
-    </w:p>
-    <w:bookmarkEnd w:id="28"/>
-    <w:bookmarkStart w:id="30" w:name="warping-the-coordinate-space"/>
-    <w:p>
-      <w:pPr>
-        <w:pStyle w:val="Heading3"/>
-      </w:pPr>
-      <w:r>
-        <w:t xml:space="preserve">Warping the Coordinate Space</w:t>
+      <w:r>
+        <w:t xml:space="preserve">Here is the exact code that calculates the warp matrix:</w:t>
+      </w:r>
+    </w:p>
+    <w:p>
+      <w:pPr>
+        <w:pStyle w:val="SourceCode"/>
+      </w:pPr>
+      <w:r>
+        <w:rPr>
+          <w:rStyle w:val="CommentTok"/>
+        </w:rPr>
+        <w:t xml:space="preserve"># Calculate scale so the pitch width matches our 1280x1280 target template</w:t>
+      </w:r>
+      <w:r>
+        <w:br/>
+      </w:r>
+      <w:r>
+        <w:rPr>
+          <w:rStyle w:val="NormalTok"/>
+        </w:rPr>
+        <w:t xml:space="preserve">scale </w:t>
+      </w:r>
+      <w:r>
+        <w:rPr>
+          <w:rStyle w:val="OperatorTok"/>
+        </w:rPr>
+        <w:t xml:space="preserve">=</w:t>
+      </w:r>
+      <w:r>
+        <w:rPr>
+          <w:rStyle w:val="NormalTok"/>
+        </w:rPr>
+        <w:t xml:space="preserve"> TARGET_PITCH_W </w:t>
+      </w:r>
+      <w:r>
+        <w:rPr>
+          <w:rStyle w:val="OperatorTok"/>
+        </w:rPr>
+        <w:t xml:space="preserve">/</w:t>
+      </w:r>
+      <w:r>
+        <w:rPr>
+          <w:rStyle w:val="NormalTok"/>
+        </w:rPr>
+        <w:t xml:space="preserve"> </w:t>
+      </w:r>
+      <w:r>
+        <w:rPr>
+          <w:rStyle w:val="BuiltInTok"/>
+        </w:rPr>
+        <w:t xml:space="preserve">max</w:t>
+      </w:r>
+      <w:r>
+        <w:rPr>
+          <w:rStyle w:val="NormalTok"/>
+        </w:rPr>
+        <w:t xml:space="preserve">(</w:t>
+      </w:r>
+      <w:r>
+        <w:rPr>
+          <w:rStyle w:val="DecValTok"/>
+        </w:rPr>
+        <w:t xml:space="preserve">10</w:t>
+      </w:r>
+      <w:r>
+        <w:rPr>
+          <w:rStyle w:val="NormalTok"/>
+        </w:rPr>
+        <w:t xml:space="preserve">, right_x </w:t>
+      </w:r>
+      <w:r>
+        <w:rPr>
+          <w:rStyle w:val="OperatorTok"/>
+        </w:rPr>
+        <w:t xml:space="preserve">-</w:t>
+      </w:r>
+      <w:r>
+        <w:rPr>
+          <w:rStyle w:val="NormalTok"/>
+        </w:rPr>
+        <w:t xml:space="preserve"> left_x)</w:t>
+      </w:r>
+      <w:r>
+        <w:br/>
+      </w:r>
+      <w:r>
+        <w:br/>
+      </w:r>
+      <w:r>
+        <w:rPr>
+          <w:rStyle w:val="CommentTok"/>
+        </w:rPr>
+        <w:t xml:space="preserve"># Create an Affine Transformation Matrix to shift and scale the frame</w:t>
+      </w:r>
+      <w:r>
+        <w:br/>
+      </w:r>
+      <w:r>
+        <w:rPr>
+          <w:rStyle w:val="NormalTok"/>
+        </w:rPr>
+        <w:t xml:space="preserve">M </w:t>
+      </w:r>
+      <w:r>
+        <w:rPr>
+          <w:rStyle w:val="OperatorTok"/>
+        </w:rPr>
+        <w:t xml:space="preserve">=</w:t>
+      </w:r>
+      <w:r>
+        <w:rPr>
+          <w:rStyle w:val="NormalTok"/>
+        </w:rPr>
+        <w:t xml:space="preserve"> np.float32([</w:t>
+      </w:r>
+      <w:r>
+        <w:br/>
+      </w:r>
+      <w:r>
+        <w:rPr>
+          <w:rStyle w:val="NormalTok"/>
+        </w:rPr>
+        <w:t xml:space="preserve">    [scale, </w:t>
+      </w:r>
+      <w:r>
+        <w:rPr>
+          <w:rStyle w:val="DecValTok"/>
+        </w:rPr>
+        <w:t xml:space="preserve">0</w:t>
+      </w:r>
+      <w:r>
+        <w:rPr>
+          <w:rStyle w:val="NormalTok"/>
+        </w:rPr>
+        <w:t xml:space="preserve">, TARGET_LEFT_X </w:t>
+      </w:r>
+      <w:r>
+        <w:rPr>
+          <w:rStyle w:val="OperatorTok"/>
+        </w:rPr>
+        <w:t xml:space="preserve">-</w:t>
+      </w:r>
+      <w:r>
+        <w:rPr>
+          <w:rStyle w:val="NormalTok"/>
+        </w:rPr>
+        <w:t xml:space="preserve"> left_x </w:t>
+      </w:r>
+      <w:r>
+        <w:rPr>
+          <w:rStyle w:val="OperatorTok"/>
+        </w:rPr>
+        <w:t xml:space="preserve">*</w:t>
+      </w:r>
+      <w:r>
+        <w:rPr>
+          <w:rStyle w:val="NormalTok"/>
+        </w:rPr>
+        <w:t xml:space="preserve"> scale],</w:t>
+      </w:r>
+      <w:r>
+        <w:br/>
+      </w:r>
+      <w:r>
+        <w:rPr>
+          <w:rStyle w:val="NormalTok"/>
+        </w:rPr>
+        <w:t xml:space="preserve">    [</w:t>
+      </w:r>
+      <w:r>
+        <w:rPr>
+          <w:rStyle w:val="DecValTok"/>
+        </w:rPr>
+        <w:t xml:space="preserve">0</w:t>
+      </w:r>
+      <w:r>
+        <w:rPr>
+          <w:rStyle w:val="NormalTok"/>
+        </w:rPr>
+        <w:t xml:space="preserve">,     scale, TARGET_LINE_Y </w:t>
+      </w:r>
+      <w:r>
+        <w:rPr>
+          <w:rStyle w:val="OperatorTok"/>
+        </w:rPr>
+        <w:t xml:space="preserve">-</w:t>
+      </w:r>
+      <w:r>
+        <w:rPr>
+          <w:rStyle w:val="NormalTok"/>
+        </w:rPr>
+        <w:t xml:space="preserve"> left_y_top </w:t>
+      </w:r>
+      <w:r>
+        <w:rPr>
+          <w:rStyle w:val="OperatorTok"/>
+        </w:rPr>
+        <w:t xml:space="preserve">*</w:t>
+      </w:r>
+      <w:r>
+        <w:rPr>
+          <w:rStyle w:val="NormalTok"/>
+        </w:rPr>
+        <w:t xml:space="preserve"> scale]</w:t>
+      </w:r>
+      <w:r>
+        <w:br/>
+      </w:r>
+      <w:r>
+        <w:rPr>
+          <w:rStyle w:val="NormalTok"/>
+        </w:rPr>
+        <w:t xml:space="preserve">])</w:t>
+      </w:r>
+      <w:r>
+        <w:br/>
+      </w:r>
+      <w:r>
+        <w:br/>
+      </w:r>
+      <w:r>
+        <w:rPr>
+          <w:rStyle w:val="CommentTok"/>
+        </w:rPr>
+        <w:t xml:space="preserve"># Warp the frame, effectively stretching it like a rubber sheet </w:t>
+      </w:r>
+      <w:r>
+        <w:br/>
+      </w:r>
+      <w:r>
+        <w:rPr>
+          <w:rStyle w:val="NormalTok"/>
+        </w:rPr>
+        <w:t xml:space="preserve">out_frame </w:t>
+      </w:r>
+      <w:r>
+        <w:rPr>
+          <w:rStyle w:val="OperatorTok"/>
+        </w:rPr>
+        <w:t xml:space="preserve">=</w:t>
+      </w:r>
+      <w:r>
+        <w:rPr>
+          <w:rStyle w:val="NormalTok"/>
+        </w:rPr>
+        <w:t xml:space="preserve"> cv2.warpAffine(frame_copy, M, (</w:t>
+      </w:r>
+      <w:r>
+        <w:rPr>
+          <w:rStyle w:val="DecValTok"/>
+        </w:rPr>
+        <w:t xml:space="preserve">1280</w:t>
+      </w:r>
+      <w:r>
+        <w:rPr>
+          <w:rStyle w:val="NormalTok"/>
+        </w:rPr>
+        <w:t xml:space="preserve">, </w:t>
+      </w:r>
+      <w:r>
+        <w:rPr>
+          <w:rStyle w:val="DecValTok"/>
+        </w:rPr>
+        <w:t xml:space="preserve">1280</w:t>
+      </w:r>
+      <w:r>
+        <w:rPr>
+          <w:rStyle w:val="NormalTok"/>
+        </w:rPr>
+        <w:t xml:space="preserve">))</w:t>
       </w:r>
     </w:p>
     <w:p>
@@ -1723,353 +2006,31 @@
         <w:pStyle w:val="FirstParagraph"/>
       </w:pPr>
       <w:r>
-        <w:t xml:space="preserve">Once the tracking model gives us the pixel coordinates of the left and right crease lines for every frame (</w:t>
-      </w:r>
-      <w:r>
-        <w:rPr>
-          <w:rStyle w:val="VerbatimChar"/>
-        </w:rPr>
-        <w:t xml:space="preserve">left_x</w:t>
-      </w:r>
-      <w:r>
-        <w:t xml:space="preserve"> </w:t>
-      </w:r>
-      <w:r>
-        <w:t xml:space="preserve">and</w:t>
-      </w:r>
-      <w:r>
-        <w:t xml:space="preserve"> </w:t>
-      </w:r>
-      <w:r>
-        <w:rPr>
-          <w:rStyle w:val="VerbatimChar"/>
-        </w:rPr>
-        <w:t xml:space="preserve">right_x</w:t>
-      </w:r>
-      <w:r>
-        <w:t xml:space="preserve">), we lock them in place using a geometric transformation.</w:t>
+        <w:t xml:space="preserve">This mathematical</w:t>
+      </w:r>
+      <w:r>
+        <w:t xml:space="preserve"> </w:t>
+      </w:r>
+      <w:r>
+        <w:t xml:space="preserve">“</w:t>
+      </w:r>
+      <w:r>
+        <w:t xml:space="preserve">rubber sheet</w:t>
+      </w:r>
+      <w:r>
+        <w:t xml:space="preserve">”</w:t>
+      </w:r>
+      <w:r>
+        <w:t xml:space="preserve"> </w:t>
+      </w:r>
+      <w:r>
+        <w:t xml:space="preserve">transformation normalizes every frame. The camera movement is completely neutralized, and the pitch is locked in place. Any movement left in the video is now the true physical motion of the player and the bat.</w:t>
       </w:r>
     </w:p>
     <w:p>
       <w:pPr>
         <w:pStyle w:val="BodyText"/>
       </w:pPr>
-      <w:r>
-        <w:t xml:space="preserve">Here is the exact code that calculates the warp matrix:</w:t>
-      </w:r>
-    </w:p>
-    <w:p>
-      <w:pPr>
-        <w:pStyle w:val="SourceCode"/>
-      </w:pPr>
-      <w:r>
-        <w:rPr>
-          <w:rStyle w:val="CommentTok"/>
-        </w:rPr>
-        <w:t xml:space="preserve"># Calculate scale so the pitch width matches our 1280x1280 target template</w:t>
-      </w:r>
-      <w:r>
-        <w:br/>
-      </w:r>
-      <w:r>
-        <w:rPr>
-          <w:rStyle w:val="NormalTok"/>
-        </w:rPr>
-        <w:t xml:space="preserve">scale </w:t>
-      </w:r>
-      <w:r>
-        <w:rPr>
-          <w:rStyle w:val="OperatorTok"/>
-        </w:rPr>
-        <w:t xml:space="preserve">=</w:t>
-      </w:r>
-      <w:r>
-        <w:rPr>
-          <w:rStyle w:val="NormalTok"/>
-        </w:rPr>
-        <w:t xml:space="preserve"> TARGET_PITCH_W </w:t>
-      </w:r>
-      <w:r>
-        <w:rPr>
-          <w:rStyle w:val="OperatorTok"/>
-        </w:rPr>
-        <w:t xml:space="preserve">/</w:t>
-      </w:r>
-      <w:r>
-        <w:rPr>
-          <w:rStyle w:val="NormalTok"/>
-        </w:rPr>
-        <w:t xml:space="preserve"> </w:t>
-      </w:r>
-      <w:r>
-        <w:rPr>
-          <w:rStyle w:val="BuiltInTok"/>
-        </w:rPr>
-        <w:t xml:space="preserve">max</w:t>
-      </w:r>
-      <w:r>
-        <w:rPr>
-          <w:rStyle w:val="NormalTok"/>
-        </w:rPr>
-        <w:t xml:space="preserve">(</w:t>
-      </w:r>
-      <w:r>
-        <w:rPr>
-          <w:rStyle w:val="DecValTok"/>
-        </w:rPr>
-        <w:t xml:space="preserve">10</w:t>
-      </w:r>
-      <w:r>
-        <w:rPr>
-          <w:rStyle w:val="NormalTok"/>
-        </w:rPr>
-        <w:t xml:space="preserve">, right_x </w:t>
-      </w:r>
-      <w:r>
-        <w:rPr>
-          <w:rStyle w:val="OperatorTok"/>
-        </w:rPr>
-        <w:t xml:space="preserve">-</w:t>
-      </w:r>
-      <w:r>
-        <w:rPr>
-          <w:rStyle w:val="NormalTok"/>
-        </w:rPr>
-        <w:t xml:space="preserve"> left_x)</w:t>
-      </w:r>
-      <w:r>
-        <w:br/>
-      </w:r>
-      <w:r>
-        <w:br/>
-      </w:r>
-      <w:r>
-        <w:rPr>
-          <w:rStyle w:val="CommentTok"/>
-        </w:rPr>
-        <w:t xml:space="preserve"># Create an Affine Transformation Matrix to shift and scale the frame</w:t>
-      </w:r>
-      <w:r>
-        <w:br/>
-      </w:r>
-      <w:r>
-        <w:rPr>
-          <w:rStyle w:val="NormalTok"/>
-        </w:rPr>
-        <w:t xml:space="preserve">M </w:t>
-      </w:r>
-      <w:r>
-        <w:rPr>
-          <w:rStyle w:val="OperatorTok"/>
-        </w:rPr>
-        <w:t xml:space="preserve">=</w:t>
-      </w:r>
-      <w:r>
-        <w:rPr>
-          <w:rStyle w:val="NormalTok"/>
-        </w:rPr>
-        <w:t xml:space="preserve"> np.float32([</w:t>
-      </w:r>
-      <w:r>
-        <w:br/>
-      </w:r>
-      <w:r>
-        <w:rPr>
-          <w:rStyle w:val="NormalTok"/>
-        </w:rPr>
-        <w:t xml:space="preserve">    [scale, </w:t>
-      </w:r>
-      <w:r>
-        <w:rPr>
-          <w:rStyle w:val="DecValTok"/>
-        </w:rPr>
-        <w:t xml:space="preserve">0</w:t>
-      </w:r>
-      <w:r>
-        <w:rPr>
-          <w:rStyle w:val="NormalTok"/>
-        </w:rPr>
-        <w:t xml:space="preserve">, TARGET_LEFT_X </w:t>
-      </w:r>
-      <w:r>
-        <w:rPr>
-          <w:rStyle w:val="OperatorTok"/>
-        </w:rPr>
-        <w:t xml:space="preserve">-</w:t>
-      </w:r>
-      <w:r>
-        <w:rPr>
-          <w:rStyle w:val="NormalTok"/>
-        </w:rPr>
-        <w:t xml:space="preserve"> left_x </w:t>
-      </w:r>
-      <w:r>
-        <w:rPr>
-          <w:rStyle w:val="OperatorTok"/>
-        </w:rPr>
-        <w:t xml:space="preserve">*</w:t>
-      </w:r>
-      <w:r>
-        <w:rPr>
-          <w:rStyle w:val="NormalTok"/>
-        </w:rPr>
-        <w:t xml:space="preserve"> scale],</w:t>
-      </w:r>
-      <w:r>
-        <w:br/>
-      </w:r>
-      <w:r>
-        <w:rPr>
-          <w:rStyle w:val="NormalTok"/>
-        </w:rPr>
-        <w:t xml:space="preserve">    [</w:t>
-      </w:r>
-      <w:r>
-        <w:rPr>
-          <w:rStyle w:val="DecValTok"/>
-        </w:rPr>
-        <w:t xml:space="preserve">0</w:t>
-      </w:r>
-      <w:r>
-        <w:rPr>
-          <w:rStyle w:val="NormalTok"/>
-        </w:rPr>
-        <w:t xml:space="preserve">,     scale, TARGET_LINE_Y </w:t>
-      </w:r>
-      <w:r>
-        <w:rPr>
-          <w:rStyle w:val="OperatorTok"/>
-        </w:rPr>
-        <w:t xml:space="preserve">-</w:t>
-      </w:r>
-      <w:r>
-        <w:rPr>
-          <w:rStyle w:val="NormalTok"/>
-        </w:rPr>
-        <w:t xml:space="preserve"> left_y_top </w:t>
-      </w:r>
-      <w:r>
-        <w:rPr>
-          <w:rStyle w:val="OperatorTok"/>
-        </w:rPr>
-        <w:t xml:space="preserve">*</w:t>
-      </w:r>
-      <w:r>
-        <w:rPr>
-          <w:rStyle w:val="NormalTok"/>
-        </w:rPr>
-        <w:t xml:space="preserve"> scale]</w:t>
-      </w:r>
-      <w:r>
-        <w:br/>
-      </w:r>
-      <w:r>
-        <w:rPr>
-          <w:rStyle w:val="NormalTok"/>
-        </w:rPr>
-        <w:t xml:space="preserve">])</w:t>
-      </w:r>
-      <w:r>
-        <w:br/>
-      </w:r>
-      <w:r>
-        <w:br/>
-      </w:r>
-      <w:r>
-        <w:rPr>
-          <w:rStyle w:val="CommentTok"/>
-        </w:rPr>
-        <w:t xml:space="preserve"># Warp the frame, effectively stretching it like a rubber sheet </w:t>
-      </w:r>
-      <w:r>
-        <w:br/>
-      </w:r>
-      <w:r>
-        <w:rPr>
-          <w:rStyle w:val="NormalTok"/>
-        </w:rPr>
-        <w:t xml:space="preserve">out_frame </w:t>
-      </w:r>
-      <w:r>
-        <w:rPr>
-          <w:rStyle w:val="OperatorTok"/>
-        </w:rPr>
-        <w:t xml:space="preserve">=</w:t>
-      </w:r>
-      <w:r>
-        <w:rPr>
-          <w:rStyle w:val="NormalTok"/>
-        </w:rPr>
-        <w:t xml:space="preserve"> cv2.warpAffine(frame_copy, M, (</w:t>
-      </w:r>
-      <w:r>
-        <w:rPr>
-          <w:rStyle w:val="DecValTok"/>
-        </w:rPr>
-        <w:t xml:space="preserve">1280</w:t>
-      </w:r>
-      <w:r>
-        <w:rPr>
-          <w:rStyle w:val="NormalTok"/>
-        </w:rPr>
-        <w:t xml:space="preserve">, </w:t>
-      </w:r>
-      <w:r>
-        <w:rPr>
-          <w:rStyle w:val="DecValTok"/>
-        </w:rPr>
-        <w:t xml:space="preserve">1280</w:t>
-      </w:r>
-      <w:r>
-        <w:rPr>
-          <w:rStyle w:val="NormalTok"/>
-        </w:rPr>
-        <w:t xml:space="preserve">))</w:t>
-      </w:r>
-    </w:p>
-    <w:p>
-      <w:pPr>
-        <w:pStyle w:val="FirstParagraph"/>
-      </w:pPr>
-      <w:r>
-        <w:t xml:space="preserve">This mathematical</w:t>
-      </w:r>
-      <w:r>
-        <w:t xml:space="preserve"> </w:t>
-      </w:r>
-      <w:r>
-        <w:t xml:space="preserve">“</w:t>
-      </w:r>
-      <w:r>
-        <w:t xml:space="preserve">rubber sheet</w:t>
-      </w:r>
-      <w:r>
-        <w:t xml:space="preserve">”</w:t>
-      </w:r>
-      <w:r>
-        <w:t xml:space="preserve"> </w:t>
-      </w:r>
-      <w:r>
-        <w:t xml:space="preserve">transformation normalizes every frame. The camera movement is completely neutralized, and the pitch is locked in place. Any movement left in the video is now the true physical motion of the player and the bat.</w:t>
-      </w:r>
-    </w:p>
-    <w:p>
-      <w:pPr>
-        <w:pStyle w:val="BodyText"/>
-      </w:pPr>
-    </w:p>
-    <w:p>
-      <w:pPr>
-        <w:pStyle w:val="BodyText"/>
-      </w:pPr>
-      <w:hyperlink r:id="rId29">
-        <w:r>
-          <w:rPr>
-            <w:rStyle w:val="Hyperlink"/>
-          </w:rPr>
-          <w:t xml:space="preserve">Watch the high-res Final Stabilized Video</w:t>
-        </w:r>
-      </w:hyperlink>
     </w:p>
     <w:p>
       <w:r>
@@ -2078,9 +2039,9 @@
         </w:pict>
       </w:r>
     </w:p>
-    <w:bookmarkEnd w:id="30"/>
-    <w:bookmarkEnd w:id="31"/>
-    <w:bookmarkStart w:id="34" w:name="X755bbcee9307e49e81f07a44dc78188a1578a97"/>
+    <w:bookmarkEnd w:id="27"/>
+    <w:bookmarkEnd w:id="28"/>
+    <w:bookmarkStart w:id="30" w:name="X755bbcee9307e49e81f07a44dc78188a1578a97"/>
     <w:p>
       <w:pPr>
         <w:pStyle w:val="Heading2"/>
@@ -2118,7 +2079,7 @@
         <w:t xml:space="preserve">, a state-of-the-art transformer trained on millions of images to predict relative depth. It doesn’t give us absolute distances in meters, but it calculates exactly which pixels are closer to the camera and which are farther away.</w:t>
       </w:r>
     </w:p>
-    <w:bookmarkStart w:id="33" w:name="the-edge-hardening-hack"/>
+    <w:bookmarkStart w:id="29" w:name="the-edge-hardening-hack"/>
     <w:p>
       <w:pPr>
         <w:pStyle w:val="Heading3"/>
@@ -2566,19 +2527,6 @@
       <w:pPr>
         <w:pStyle w:val="FirstParagraph"/>
       </w:pPr>
-    </w:p>
-    <w:p>
-      <w:pPr>
-        <w:pStyle w:val="BodyText"/>
-      </w:pPr>
-      <w:hyperlink r:id="rId32">
-        <w:r>
-          <w:rPr>
-            <w:rStyle w:val="Hyperlink"/>
-          </w:rPr>
-          <w:t xml:space="preserve">Watch the high-res Depth Video</w:t>
-        </w:r>
-      </w:hyperlink>
     </w:p>
     <w:p>
       <w:r>
@@ -2587,9 +2535,9 @@
         </w:pict>
       </w:r>
     </w:p>
-    <w:bookmarkEnd w:id="33"/>
-    <w:bookmarkEnd w:id="34"/>
-    <w:bookmarkStart w:id="38" w:name="stage-3b-the-bat-vs.-wicket-war"/>
+    <w:bookmarkEnd w:id="29"/>
+    <w:bookmarkEnd w:id="30"/>
+    <w:bookmarkStart w:id="33" w:name="stage-3b-the-bat-vs.-wicket-war"/>
     <w:p>
       <w:pPr>
         <w:pStyle w:val="Heading2"/>
@@ -2676,7 +2624,7 @@
         <w:t xml:space="preserve">the tracking model would confidently highlight the wicket stumps as well, treating them as if they were bats.</w:t>
       </w:r>
     </w:p>
-    <w:bookmarkStart w:id="35" w:name="the-dual-session-subtraction-trick"/>
+    <w:bookmarkStart w:id="31" w:name="the-dual-session-subtraction-trick"/>
     <w:p>
       <w:pPr>
         <w:pStyle w:val="Heading3"/>
@@ -2899,8 +2847,8 @@
         <w:t xml:space="preserve"> all_fidxs}</w:t>
       </w:r>
     </w:p>
-    <w:bookmarkEnd w:id="35"/>
-    <w:bookmarkStart w:id="37" w:name="filtering-with-the-wicket-zone"/>
+    <w:bookmarkEnd w:id="31"/>
+    <w:bookmarkStart w:id="32" w:name="filtering-with-the-wicket-zone"/>
     <w:p>
       <w:pPr>
         <w:pStyle w:val="Heading3"/>
@@ -3029,19 +2977,6 @@
       <w:pPr>
         <w:pStyle w:val="BodyText"/>
       </w:pPr>
-    </w:p>
-    <w:p>
-      <w:pPr>
-        <w:pStyle w:val="BodyText"/>
-      </w:pPr>
-      <w:hyperlink r:id="rId36">
-        <w:r>
-          <w:rPr>
-            <w:rStyle w:val="Hyperlink"/>
-          </w:rPr>
-          <w:t xml:space="preserve">Watch the high-res 3-Panel Video</w:t>
-        </w:r>
-      </w:hyperlink>
     </w:p>
     <w:p>
       <w:r>
@@ -3050,9 +2985,9 @@
         </w:pict>
       </w:r>
     </w:p>
-    <w:bookmarkEnd w:id="37"/>
-    <w:bookmarkEnd w:id="38"/>
-    <w:bookmarkStart w:id="42" w:name="X7a98a446de14d596295da1c4fb81a6f6ecc5c07"/>
+    <w:bookmarkEnd w:id="32"/>
+    <w:bookmarkEnd w:id="33"/>
+    <w:bookmarkStart w:id="36" w:name="X7a98a446de14d596295da1c4fb81a6f6ecc5c07"/>
     <w:p>
       <w:pPr>
         <w:pStyle w:val="Heading2"/>
@@ -3101,7 +3036,7 @@
         <w:t xml:space="preserve">(the far end of the bat).</w:t>
       </w:r>
     </w:p>
-    <w:bookmarkStart w:id="39" w:name="finding-the-bats-axis-with-pca"/>
+    <w:bookmarkStart w:id="34" w:name="finding-the-bats-axis-with-pca"/>
     <w:p>
       <w:pPr>
         <w:pStyle w:val="Heading3"/>
@@ -3430,8 +3365,8 @@
         <w:t xml:space="preserve">But there is a catch: math doesn’t know which end is the handle and which end is the tip!</w:t>
       </w:r>
     </w:p>
-    <w:bookmarkEnd w:id="39"/>
-    <w:bookmarkStart w:id="41" w:name="wrist-tracking-for-classification"/>
+    <w:bookmarkEnd w:id="34"/>
+    <w:bookmarkStart w:id="35" w:name="wrist-tracking-for-classification"/>
     <w:p>
       <w:pPr>
         <w:pStyle w:val="Heading3"/>
@@ -3540,19 +3475,6 @@
       <w:pPr>
         <w:pStyle w:val="BodyText"/>
       </w:pPr>
-    </w:p>
-    <w:p>
-      <w:pPr>
-        <w:pStyle w:val="BodyText"/>
-      </w:pPr>
-      <w:hyperlink r:id="rId40">
-        <w:r>
-          <w:rPr>
-            <w:rStyle w:val="Hyperlink"/>
-          </w:rPr>
-          <w:t xml:space="preserve">Watch the high-res PCA Detection Video</w:t>
-        </w:r>
-      </w:hyperlink>
     </w:p>
     <w:p>
       <w:r>
@@ -3561,9 +3483,9 @@
         </w:pict>
       </w:r>
     </w:p>
-    <w:bookmarkEnd w:id="41"/>
-    <w:bookmarkEnd w:id="42"/>
-    <w:bookmarkStart w:id="45" w:name="X47f118ac3e87664909d60d3bb0a50364cc84ede"/>
+    <w:bookmarkEnd w:id="35"/>
+    <w:bookmarkEnd w:id="36"/>
+    <w:bookmarkStart w:id="39" w:name="X47f118ac3e87664909d60d3bb0a50364cc84ede"/>
     <w:p>
       <w:pPr>
         <w:pStyle w:val="Heading2"/>
@@ -3608,7 +3530,7 @@
         <w:t xml:space="preserve">However, these raw 3D observations are imperfect and prone to missing data. First, the segmentation model might occasionally drop the bat mask for a frame, leaving us with missing (X, Y) coordinates. Second, because monocular depth models predict depth frame-by-frame without temporal consistency, the depth (Z) can flicker or become noisy. Finally, when the bat crosses behind the batsman’s body during the swing, we lose sight of it entirely.</w:t>
       </w:r>
     </w:p>
-    <w:bookmarkStart w:id="43" w:name="X776daa878905ed57c9b4003b8de692af37822bb"/>
+    <w:bookmarkStart w:id="37" w:name="X776daa878905ed57c9b4003b8de692af37822bb"/>
     <w:p>
       <w:pPr>
         <w:pStyle w:val="Heading3"/>
@@ -3667,8 +3589,8 @@
         <w:t xml:space="preserve">is immediately discarded as a model hallucination. We also discard any keypoints that fall into the pure-black padding added during stabilization.</w:t>
       </w:r>
     </w:p>
-    <w:bookmarkEnd w:id="43"/>
-    <w:bookmarkStart w:id="44" w:name="the-9-state-kalman-rts-smoother"/>
+    <w:bookmarkEnd w:id="37"/>
+    <w:bookmarkStart w:id="38" w:name="the-9-state-kalman-rts-smoother"/>
     <w:p>
       <w:pPr>
         <w:pStyle w:val="Heading3"/>
@@ -5112,9 +5034,9 @@
         <w:t xml:space="preserve">after the occlusion to perfectly infer where the bat was, producing a flawless, unbroken 3D curve.</w:t>
       </w:r>
     </w:p>
-    <w:bookmarkEnd w:id="44"/>
-    <w:bookmarkEnd w:id="45"/>
-    <w:bookmarkStart w:id="48" w:name="stage-6-the-3d-animation"/>
+    <w:bookmarkEnd w:id="38"/>
+    <w:bookmarkEnd w:id="39"/>
+    <w:bookmarkStart w:id="41" w:name="stage-6-the-3d-animation"/>
     <w:p>
       <w:pPr>
         <w:pStyle w:val="Heading2"/>
@@ -5575,7 +5497,7 @@
         <w:t xml:space="preserve">The leading edge of the bat is marked with two bright dots (the tip and handle) connected by a solid white line to show its exact orientation at the current millisecond.</w:t>
       </w:r>
     </w:p>
-    <w:bookmarkStart w:id="47" w:name="fast-parallel-rendering"/>
+    <w:bookmarkStart w:id="40" w:name="fast-parallel-rendering"/>
     <w:p>
       <w:pPr>
         <w:pStyle w:val="Heading3"/>
@@ -5855,19 +5777,6 @@
       <w:pPr>
         <w:pStyle w:val="BodyText"/>
       </w:pPr>
-    </w:p>
-    <w:p>
-      <w:pPr>
-        <w:pStyle w:val="BodyText"/>
-      </w:pPr>
-      <w:hyperlink r:id="rId46">
-        <w:r>
-          <w:rPr>
-            <w:rStyle w:val="Hyperlink"/>
-          </w:rPr>
-          <w:t xml:space="preserve">Watch the high-res 3D Swing Plane Video</w:t>
-        </w:r>
-      </w:hyperlink>
     </w:p>
     <w:p>
       <w:r>
@@ -5876,9 +5785,9 @@
         </w:pict>
       </w:r>
     </w:p>
-    <w:bookmarkEnd w:id="47"/>
-    <w:bookmarkEnd w:id="48"/>
-    <w:bookmarkStart w:id="49" w:name="X88bbf01da0d7ef6e11341a6f0ad6b1adf849927"/>
+    <w:bookmarkEnd w:id="40"/>
+    <w:bookmarkEnd w:id="41"/>
+    <w:bookmarkStart w:id="42" w:name="X88bbf01da0d7ef6e11341a6f0ad6b1adf849927"/>
     <w:p>
       <w:pPr>
         <w:pStyle w:val="Heading2"/>
@@ -6245,8 +6154,8 @@
         </w:pict>
       </w:r>
     </w:p>
-    <w:bookmarkEnd w:id="49"/>
-    <w:bookmarkStart w:id="52" w:name="what-went-wrong-lessons-learned"/>
+    <w:bookmarkEnd w:id="42"/>
+    <w:bookmarkStart w:id="45" w:name="what-went-wrong-lessons-learned"/>
     <w:p>
       <w:pPr>
         <w:pStyle w:val="Heading2"/>
@@ -6263,7 +6172,7 @@
         <w:t xml:space="preserve">No engineering project is complete without a list of things that broke along the way.</w:t>
       </w:r>
     </w:p>
-    <w:bookmarkStart w:id="50" w:name="tracking-the-wrong-object"/>
+    <w:bookmarkStart w:id="43" w:name="tracking-the-wrong-object"/>
     <w:p>
       <w:pPr>
         <w:pStyle w:val="Heading3"/>
@@ -6280,8 +6189,8 @@
         <w:t xml:space="preserve">In early versions, the video segmentation model locked onto the wicket stumps instead of the bat in ~20% of videos. The stumps and bat are both long, thin, wooden objects. The dual-session subtraction trick (Stage 3b) solved this completely.</w:t>
       </w:r>
     </w:p>
-    <w:bookmarkEnd w:id="50"/>
-    <w:bookmarkStart w:id="51" w:name="camera-shake-corrupting-depth"/>
+    <w:bookmarkEnd w:id="43"/>
+    <w:bookmarkStart w:id="44" w:name="camera-shake-corrupting-depth"/>
     <w:p>
       <w:pPr>
         <w:pStyle w:val="Heading3"/>
@@ -6321,9 +6230,9 @@
         </w:pict>
       </w:r>
     </w:p>
-    <w:bookmarkEnd w:id="51"/>
-    <w:bookmarkEnd w:id="52"/>
-    <w:bookmarkStart w:id="53" w:name="the-power-of-zero-shot-ai"/>
+    <w:bookmarkEnd w:id="44"/>
+    <w:bookmarkEnd w:id="45"/>
+    <w:bookmarkStart w:id="46" w:name="the-power-of-zero-shot-ai"/>
     <w:p>
       <w:pPr>
         <w:pStyle w:val="Heading2"/>
@@ -6444,8 +6353,8 @@
         <w:t xml:space="preserve">By forcing these generalized models to collaborate, we achieved highly specific, 3D tracking without ever having to collect and label thousands of cricket videos for training.</w:t>
       </w:r>
     </w:p>
-    <w:bookmarkEnd w:id="53"/>
-    <w:bookmarkStart w:id="54" w:name="conclusion-beyond-cricket"/>
+    <w:bookmarkEnd w:id="46"/>
+    <w:bookmarkStart w:id="47" w:name="conclusion-beyond-cricket"/>
     <w:p>
       <w:pPr>
         <w:pStyle w:val="Heading2"/>
@@ -6478,8 +6387,8 @@
         <w:t xml:space="preserve">Ultimately, this pipeline is a blueprint for how we can use AI to pull structured 3D data out of standard 2D video, reducing our reliance on specialized hardware.</w:t>
       </w:r>
     </w:p>
-    <w:bookmarkEnd w:id="54"/>
-    <w:bookmarkStart w:id="55" w:name="references"/>
+    <w:bookmarkEnd w:id="47"/>
+    <w:bookmarkStart w:id="48" w:name="references"/>
     <w:p>
       <w:pPr>
         <w:pStyle w:val="Heading2"/>
@@ -6583,8 +6492,8 @@
         </w:pict>
       </w:r>
     </w:p>
-    <w:bookmarkEnd w:id="55"/>
-    <w:bookmarkEnd w:id="56"/>
+    <w:bookmarkEnd w:id="48"/>
+    <w:bookmarkEnd w:id="49"/>
     <w:sectPr/>
   </w:body>
 </w:document>
@@ -7052,7 +6961,7 @@
       <w:rFonts w:asciiTheme="majorHAnsi" w:cstheme="majorBidi" w:eastAsiaTheme="majorEastAsia" w:hAnsiTheme="majorHAnsi"/>
       <w:b/>
       <w:bCs/>
-      <w:color w:themeColor="accent1" w:val="4F81BD"/>
+      <w:color w:val="000000"/>
       <w:sz w:val="32"/>
       <w:szCs w:val="32"/>
     </w:rPr>
@@ -7074,7 +6983,7 @@
       <w:rFonts w:asciiTheme="majorHAnsi" w:cstheme="majorBidi" w:eastAsiaTheme="majorEastAsia" w:hAnsiTheme="majorHAnsi"/>
       <w:b/>
       <w:bCs/>
-      <w:color w:themeColor="accent1" w:val="4F81BD"/>
+      <w:color w:val="000000"/>
       <w:sz w:val="28"/>
       <w:szCs w:val="28"/>
     </w:rPr>
@@ -7096,7 +7005,7 @@
       <w:rFonts w:asciiTheme="majorHAnsi" w:cstheme="majorBidi" w:eastAsiaTheme="majorEastAsia" w:hAnsiTheme="majorHAnsi"/>
       <w:b/>
       <w:bCs/>
-      <w:color w:themeColor="accent1" w:val="4F81BD"/>
+      <w:color w:val="000000"/>
       <w:sz w:val="24"/>
       <w:szCs w:val="24"/>
     </w:rPr>
@@ -7118,7 +7027,7 @@
       <w:rFonts w:asciiTheme="majorHAnsi" w:cstheme="majorBidi" w:eastAsiaTheme="majorEastAsia" w:hAnsiTheme="majorHAnsi"/>
       <w:bCs/>
       <w:i/>
-      <w:color w:themeColor="accent1" w:val="4F81BD"/>
+      <w:color w:val="000000"/>
       <w:sz w:val="24"/>
       <w:szCs w:val="24"/>
     </w:rPr>
@@ -7139,7 +7048,7 @@
     <w:rPr>
       <w:rFonts w:asciiTheme="majorHAnsi" w:cstheme="majorBidi" w:eastAsiaTheme="majorEastAsia" w:hAnsiTheme="majorHAnsi"/>
       <w:iCs/>
-      <w:color w:themeColor="accent1" w:val="4F81BD"/>
+      <w:color w:val="000000"/>
       <w:sz w:val="24"/>
       <w:szCs w:val="24"/>
     </w:rPr>
@@ -7159,7 +7068,7 @@
     </w:pPr>
     <w:rPr>
       <w:rFonts w:asciiTheme="majorHAnsi" w:cstheme="majorBidi" w:eastAsiaTheme="majorEastAsia" w:hAnsiTheme="majorHAnsi"/>
-      <w:color w:themeColor="accent1" w:val="4F81BD"/>
+      <w:color w:val="000000"/>
       <w:sz w:val="24"/>
       <w:szCs w:val="24"/>
     </w:rPr>
@@ -7179,7 +7088,7 @@
     </w:pPr>
     <w:rPr>
       <w:rFonts w:asciiTheme="majorHAnsi" w:cstheme="majorBidi" w:eastAsiaTheme="majorEastAsia" w:hAnsiTheme="majorHAnsi"/>
-      <w:color w:themeColor="accent1" w:val="4F81BD"/>
+      <w:color w:val="000000"/>
       <w:sz w:val="24"/>
       <w:szCs w:val="24"/>
     </w:rPr>
@@ -7199,7 +7108,7 @@
     </w:pPr>
     <w:rPr>
       <w:rFonts w:asciiTheme="majorHAnsi" w:cstheme="majorBidi" w:eastAsiaTheme="majorEastAsia" w:hAnsiTheme="majorHAnsi"/>
-      <w:color w:themeColor="accent1" w:val="4F81BD"/>
+      <w:color w:val="000000"/>
       <w:sz w:val="24"/>
       <w:szCs w:val="24"/>
     </w:rPr>
@@ -7219,7 +7128,7 @@
     </w:pPr>
     <w:rPr>
       <w:rFonts w:asciiTheme="majorHAnsi" w:cstheme="majorBidi" w:eastAsiaTheme="majorEastAsia" w:hAnsiTheme="majorHAnsi"/>
-      <w:color w:themeColor="accent1" w:val="4F81BD"/>
+      <w:color w:val="000000"/>
       <w:sz w:val="24"/>
       <w:szCs w:val="24"/>
     </w:rPr>

</xml_diff>

<commit_message>
Update title to Virat Kohli signature flick, update SAM reference, and style headings to black in DOCX
</commit_message>
<xml_diff>
--- a/blog_draft_2.docx
+++ b/blog_draft_2.docx
@@ -2,13 +2,13 @@
 <file path=word/document.xml><?xml version="1.0" encoding="utf-8"?>
 <w:document xmlns:w="http://schemas.openxmlformats.org/wordprocessingml/2006/main" xmlns:m="http://schemas.openxmlformats.org/officeDocument/2006/math" xmlns:r="http://schemas.openxmlformats.org/officeDocument/2006/relationships" xmlns:o="urn:schemas-microsoft-com:office:office" xmlns:v="urn:schemas-microsoft-com:vml" xmlns:w10="urn:schemas-microsoft-com:office:word" xmlns:a="http://schemas.openxmlformats.org/drawingml/2006/main" xmlns:pic="http://schemas.openxmlformats.org/drawingml/2006/picture" xmlns:wp="http://schemas.openxmlformats.org/drawingml/2006/wordprocessingDrawing">
   <w:body>
-    <w:bookmarkStart w:id="49" w:name="X23f5f6e5cf9dc5e5fd06aa1f60de30f6aeb92ce"/>
+    <w:bookmarkStart w:id="56" w:name="Xe1d45ef0076c855e778b61bb4990f6121593462"/>
     <w:p>
       <w:pPr>
         <w:pStyle w:val="Heading1"/>
       </w:pPr>
       <w:r>
-        <w:t xml:space="preserve">3D Cricket Bat Trajectory: Mapping the Swing Plane from Unstable 2D Video</w:t>
+        <w:t xml:space="preserve">Decoding Virat Kohli’s Signature Flick in 3D: Mapping the Bat Swing Plane from Raw 2D Video</w:t>
       </w:r>
     </w:p>
     <w:p>
@@ -20,7 +20,7 @@
           <w:i/>
           <w:iCs/>
         </w:rPr>
-        <w:t xml:space="preserve">Extracting the precise 3D bat swing plane from a standard 2D video-no sensors, no multi-camera rigs, just AI.</w:t>
+        <w:t xml:space="preserve">Extracting the precise 3D bat swing plane from standard, unstable 2D video—no sensors, no multi-camera rigs, just AI.</w:t>
       </w:r>
     </w:p>
     <w:p>
@@ -35,7 +35,20 @@
         <w:pStyle w:val="FirstParagraph"/>
       </w:pPr>
     </w:p>
-    <w:bookmarkStart w:id="20" w:name="X66041c6dc78ae9159bcd46a489ffae9aa36d02a"/>
+    <w:p>
+      <w:pPr>
+        <w:pStyle w:val="BodyText"/>
+      </w:pPr>
+      <w:hyperlink r:id="rId20">
+        <w:r>
+          <w:rPr>
+            <w:rStyle w:val="Hyperlink"/>
+          </w:rPr>
+          <w:t xml:space="preserve">Watch the full 3D Swing Plane Video</w:t>
+        </w:r>
+      </w:hyperlink>
+    </w:p>
+    <w:bookmarkStart w:id="21" w:name="X66041c6dc78ae9159bcd46a489ffae9aa36d02a"/>
     <w:p>
       <w:pPr>
         <w:pStyle w:val="Heading2"/>
@@ -160,8 +173,8 @@
         </w:pict>
       </w:r>
     </w:p>
-    <w:bookmarkEnd w:id="20"/>
-    <w:bookmarkStart w:id="21" w:name="X75fc55bd7b3628a4a22a5b2ee633f8c329c107c"/>
+    <w:bookmarkEnd w:id="21"/>
+    <w:bookmarkStart w:id="22" w:name="X75fc55bd7b3628a4a22a5b2ee633f8c329c107c"/>
     <w:p>
       <w:pPr>
         <w:pStyle w:val="Heading2"/>
@@ -324,8 +337,8 @@
         </w:pict>
       </w:r>
     </w:p>
-    <w:bookmarkEnd w:id="21"/>
-    <w:bookmarkStart w:id="22" w:name="the-architecture-at-a-glance"/>
+    <w:bookmarkEnd w:id="22"/>
+    <w:bookmarkStart w:id="23" w:name="the-architecture-at-a-glance"/>
     <w:p>
       <w:pPr>
         <w:pStyle w:val="Heading2"/>
@@ -545,8 +558,8 @@
         </w:pict>
       </w:r>
     </w:p>
-    <w:bookmarkEnd w:id="22"/>
-    <w:bookmarkStart w:id="25" w:name="stage-1-isolating-the-active-swing"/>
+    <w:bookmarkEnd w:id="23"/>
+    <w:bookmarkStart w:id="26" w:name="stage-1-isolating-the-active-swing"/>
     <w:p>
       <w:pPr>
         <w:pStyle w:val="Heading2"/>
@@ -631,7 +644,7 @@
         <w:t xml:space="preserve">detects people and extracts their skeletal keypoints (like their wrists).</w:t>
       </w:r>
     </w:p>
-    <w:bookmarkStart w:id="23" w:name="tracing-the-batsman-match-scores"/>
+    <w:bookmarkStart w:id="24" w:name="tracing-the-batsman-match-scores"/>
     <w:p>
       <w:pPr>
         <w:pStyle w:val="Heading3"/>
@@ -762,8 +775,8 @@
         <w:t xml:space="preserve">Keeping track of who is on the left or right so we don’t swap identities when people pass each other.</w:t>
       </w:r>
     </w:p>
-    <w:bookmarkEnd w:id="23"/>
-    <w:bookmarkStart w:id="24" w:name="selecting-the-active-swinger-with-code"/>
+    <w:bookmarkEnd w:id="24"/>
+    <w:bookmarkStart w:id="25" w:name="selecting-the-active-swinger-with-code"/>
     <w:p>
       <w:pPr>
         <w:pStyle w:val="Heading3"/>
@@ -1551,9 +1564,9 @@
         </w:pict>
       </w:r>
     </w:p>
-    <w:bookmarkEnd w:id="24"/>
     <w:bookmarkEnd w:id="25"/>
-    <w:bookmarkStart w:id="28" w:name="X17eaa4f7b143b561c5063aa7b7b05110300b522"/>
+    <w:bookmarkEnd w:id="26"/>
+    <w:bookmarkStart w:id="31" w:name="X17eaa4f7b143b561c5063aa7b7b05110300b522"/>
     <w:p>
       <w:pPr>
         <w:pStyle w:val="Heading2"/>
@@ -1594,7 +1607,7 @@
         <w:t xml:space="preserve">Every pitch has two white crease lines painted on the ground (the bowling and batting creases). If we can locate these lines in every frame, we can warp the video so that the crease lines always sit in the exact same pixel positions.</w:t>
       </w:r>
     </w:p>
-    <w:bookmarkStart w:id="26" w:name="X14b169e0494e760fcf63057473f4c62881c27cd"/>
+    <w:bookmarkStart w:id="28" w:name="X14b169e0494e760fcf63057473f4c62881c27cd"/>
     <w:p>
       <w:pPr>
         <w:pStyle w:val="Heading3"/>
@@ -1682,8 +1695,21 @@
         <w:pStyle w:val="BodyText"/>
       </w:pPr>
     </w:p>
-    <w:bookmarkEnd w:id="26"/>
-    <w:bookmarkStart w:id="27" w:name="warping-the-coordinate-space"/>
+    <w:p>
+      <w:pPr>
+        <w:pStyle w:val="BodyText"/>
+      </w:pPr>
+      <w:hyperlink r:id="rId27">
+        <w:r>
+          <w:rPr>
+            <w:rStyle w:val="Hyperlink"/>
+          </w:rPr>
+          <w:t xml:space="preserve">Watch the high-res Pitch Detection Bounding Box Video</w:t>
+        </w:r>
+      </w:hyperlink>
+    </w:p>
+    <w:bookmarkEnd w:id="28"/>
+    <w:bookmarkStart w:id="30" w:name="warping-the-coordinate-space"/>
     <w:p>
       <w:pPr>
         <w:pStyle w:val="Heading3"/>
@@ -2031,6 +2057,19 @@
       <w:pPr>
         <w:pStyle w:val="BodyText"/>
       </w:pPr>
+    </w:p>
+    <w:p>
+      <w:pPr>
+        <w:pStyle w:val="BodyText"/>
+      </w:pPr>
+      <w:hyperlink r:id="rId29">
+        <w:r>
+          <w:rPr>
+            <w:rStyle w:val="Hyperlink"/>
+          </w:rPr>
+          <w:t xml:space="preserve">Watch the high-res Final Stabilized Video</w:t>
+        </w:r>
+      </w:hyperlink>
     </w:p>
     <w:p>
       <w:r>
@@ -2039,9 +2078,9 @@
         </w:pict>
       </w:r>
     </w:p>
-    <w:bookmarkEnd w:id="27"/>
-    <w:bookmarkEnd w:id="28"/>
-    <w:bookmarkStart w:id="30" w:name="X755bbcee9307e49e81f07a44dc78188a1578a97"/>
+    <w:bookmarkEnd w:id="30"/>
+    <w:bookmarkEnd w:id="31"/>
+    <w:bookmarkStart w:id="34" w:name="X755bbcee9307e49e81f07a44dc78188a1578a97"/>
     <w:p>
       <w:pPr>
         <w:pStyle w:val="Heading2"/>
@@ -2079,7 +2118,7 @@
         <w:t xml:space="preserve">, a state-of-the-art transformer trained on millions of images to predict relative depth. It doesn’t give us absolute distances in meters, but it calculates exactly which pixels are closer to the camera and which are farther away.</w:t>
       </w:r>
     </w:p>
-    <w:bookmarkStart w:id="29" w:name="the-edge-hardening-hack"/>
+    <w:bookmarkStart w:id="33" w:name="the-edge-hardening-hack"/>
     <w:p>
       <w:pPr>
         <w:pStyle w:val="Heading3"/>
@@ -2527,6 +2566,19 @@
       <w:pPr>
         <w:pStyle w:val="FirstParagraph"/>
       </w:pPr>
+    </w:p>
+    <w:p>
+      <w:pPr>
+        <w:pStyle w:val="BodyText"/>
+      </w:pPr>
+      <w:hyperlink r:id="rId32">
+        <w:r>
+          <w:rPr>
+            <w:rStyle w:val="Hyperlink"/>
+          </w:rPr>
+          <w:t xml:space="preserve">Watch the high-res Depth Video</w:t>
+        </w:r>
+      </w:hyperlink>
     </w:p>
     <w:p>
       <w:r>
@@ -2535,9 +2587,9 @@
         </w:pict>
       </w:r>
     </w:p>
-    <w:bookmarkEnd w:id="29"/>
-    <w:bookmarkEnd w:id="30"/>
-    <w:bookmarkStart w:id="33" w:name="stage-3b-the-bat-vs.-wicket-war"/>
+    <w:bookmarkEnd w:id="33"/>
+    <w:bookmarkEnd w:id="34"/>
+    <w:bookmarkStart w:id="38" w:name="stage-3b-the-bat-vs.-wicket-war"/>
     <w:p>
       <w:pPr>
         <w:pStyle w:val="Heading2"/>
@@ -2624,7 +2676,7 @@
         <w:t xml:space="preserve">the tracking model would confidently highlight the wicket stumps as well, treating them as if they were bats.</w:t>
       </w:r>
     </w:p>
-    <w:bookmarkStart w:id="31" w:name="the-dual-session-subtraction-trick"/>
+    <w:bookmarkStart w:id="35" w:name="the-dual-session-subtraction-trick"/>
     <w:p>
       <w:pPr>
         <w:pStyle w:val="Heading3"/>
@@ -2847,8 +2899,8 @@
         <w:t xml:space="preserve"> all_fidxs}</w:t>
       </w:r>
     </w:p>
-    <w:bookmarkEnd w:id="31"/>
-    <w:bookmarkStart w:id="32" w:name="filtering-with-the-wicket-zone"/>
+    <w:bookmarkEnd w:id="35"/>
+    <w:bookmarkStart w:id="37" w:name="filtering-with-the-wicket-zone"/>
     <w:p>
       <w:pPr>
         <w:pStyle w:val="Heading3"/>
@@ -2977,6 +3029,19 @@
       <w:pPr>
         <w:pStyle w:val="BodyText"/>
       </w:pPr>
+    </w:p>
+    <w:p>
+      <w:pPr>
+        <w:pStyle w:val="BodyText"/>
+      </w:pPr>
+      <w:hyperlink r:id="rId36">
+        <w:r>
+          <w:rPr>
+            <w:rStyle w:val="Hyperlink"/>
+          </w:rPr>
+          <w:t xml:space="preserve">Watch the high-res 3-Panel Video</w:t>
+        </w:r>
+      </w:hyperlink>
     </w:p>
     <w:p>
       <w:r>
@@ -2985,9 +3050,9 @@
         </w:pict>
       </w:r>
     </w:p>
-    <w:bookmarkEnd w:id="32"/>
-    <w:bookmarkEnd w:id="33"/>
-    <w:bookmarkStart w:id="36" w:name="X7a98a446de14d596295da1c4fb81a6f6ecc5c07"/>
+    <w:bookmarkEnd w:id="37"/>
+    <w:bookmarkEnd w:id="38"/>
+    <w:bookmarkStart w:id="42" w:name="X7a98a446de14d596295da1c4fb81a6f6ecc5c07"/>
     <w:p>
       <w:pPr>
         <w:pStyle w:val="Heading2"/>
@@ -3036,7 +3101,7 @@
         <w:t xml:space="preserve">(the far end of the bat).</w:t>
       </w:r>
     </w:p>
-    <w:bookmarkStart w:id="34" w:name="finding-the-bats-axis-with-pca"/>
+    <w:bookmarkStart w:id="39" w:name="finding-the-bats-axis-with-pca"/>
     <w:p>
       <w:pPr>
         <w:pStyle w:val="Heading3"/>
@@ -3365,8 +3430,8 @@
         <w:t xml:space="preserve">But there is a catch: math doesn’t know which end is the handle and which end is the tip!</w:t>
       </w:r>
     </w:p>
-    <w:bookmarkEnd w:id="34"/>
-    <w:bookmarkStart w:id="35" w:name="wrist-tracking-for-classification"/>
+    <w:bookmarkEnd w:id="39"/>
+    <w:bookmarkStart w:id="41" w:name="wrist-tracking-for-classification"/>
     <w:p>
       <w:pPr>
         <w:pStyle w:val="Heading3"/>
@@ -3475,6 +3540,19 @@
       <w:pPr>
         <w:pStyle w:val="BodyText"/>
       </w:pPr>
+    </w:p>
+    <w:p>
+      <w:pPr>
+        <w:pStyle w:val="BodyText"/>
+      </w:pPr>
+      <w:hyperlink r:id="rId40">
+        <w:r>
+          <w:rPr>
+            <w:rStyle w:val="Hyperlink"/>
+          </w:rPr>
+          <w:t xml:space="preserve">Watch the high-res PCA Detection Video</w:t>
+        </w:r>
+      </w:hyperlink>
     </w:p>
     <w:p>
       <w:r>
@@ -3483,9 +3561,9 @@
         </w:pict>
       </w:r>
     </w:p>
-    <w:bookmarkEnd w:id="35"/>
-    <w:bookmarkEnd w:id="36"/>
-    <w:bookmarkStart w:id="39" w:name="X47f118ac3e87664909d60d3bb0a50364cc84ede"/>
+    <w:bookmarkEnd w:id="41"/>
+    <w:bookmarkEnd w:id="42"/>
+    <w:bookmarkStart w:id="45" w:name="X47f118ac3e87664909d60d3bb0a50364cc84ede"/>
     <w:p>
       <w:pPr>
         <w:pStyle w:val="Heading2"/>
@@ -3530,7 +3608,7 @@
         <w:t xml:space="preserve">However, these raw 3D observations are imperfect and prone to missing data. First, the segmentation model might occasionally drop the bat mask for a frame, leaving us with missing (X, Y) coordinates. Second, because monocular depth models predict depth frame-by-frame without temporal consistency, the depth (Z) can flicker or become noisy. Finally, when the bat crosses behind the batsman’s body during the swing, we lose sight of it entirely.</w:t>
       </w:r>
     </w:p>
-    <w:bookmarkStart w:id="37" w:name="X776daa878905ed57c9b4003b8de692af37822bb"/>
+    <w:bookmarkStart w:id="43" w:name="X776daa878905ed57c9b4003b8de692af37822bb"/>
     <w:p>
       <w:pPr>
         <w:pStyle w:val="Heading3"/>
@@ -3589,8 +3667,8 @@
         <w:t xml:space="preserve">is immediately discarded as a model hallucination. We also discard any keypoints that fall into the pure-black padding added during stabilization.</w:t>
       </w:r>
     </w:p>
-    <w:bookmarkEnd w:id="37"/>
-    <w:bookmarkStart w:id="38" w:name="the-9-state-kalman-rts-smoother"/>
+    <w:bookmarkEnd w:id="43"/>
+    <w:bookmarkStart w:id="44" w:name="the-9-state-kalman-rts-smoother"/>
     <w:p>
       <w:pPr>
         <w:pStyle w:val="Heading3"/>
@@ -5034,9 +5112,9 @@
         <w:t xml:space="preserve">after the occlusion to perfectly infer where the bat was, producing a flawless, unbroken 3D curve.</w:t>
       </w:r>
     </w:p>
-    <w:bookmarkEnd w:id="38"/>
-    <w:bookmarkEnd w:id="39"/>
-    <w:bookmarkStart w:id="41" w:name="stage-6-the-3d-animation"/>
+    <w:bookmarkEnd w:id="44"/>
+    <w:bookmarkEnd w:id="45"/>
+    <w:bookmarkStart w:id="48" w:name="stage-6-the-3d-animation"/>
     <w:p>
       <w:pPr>
         <w:pStyle w:val="Heading2"/>
@@ -5497,7 +5575,7 @@
         <w:t xml:space="preserve">The leading edge of the bat is marked with two bright dots (the tip and handle) connected by a solid white line to show its exact orientation at the current millisecond.</w:t>
       </w:r>
     </w:p>
-    <w:bookmarkStart w:id="40" w:name="fast-parallel-rendering"/>
+    <w:bookmarkStart w:id="47" w:name="fast-parallel-rendering"/>
     <w:p>
       <w:pPr>
         <w:pStyle w:val="Heading3"/>
@@ -5777,6 +5855,19 @@
       <w:pPr>
         <w:pStyle w:val="BodyText"/>
       </w:pPr>
+    </w:p>
+    <w:p>
+      <w:pPr>
+        <w:pStyle w:val="BodyText"/>
+      </w:pPr>
+      <w:hyperlink r:id="rId46">
+        <w:r>
+          <w:rPr>
+            <w:rStyle w:val="Hyperlink"/>
+          </w:rPr>
+          <w:t xml:space="preserve">Watch the high-res 3D Swing Plane Video</w:t>
+        </w:r>
+      </w:hyperlink>
     </w:p>
     <w:p>
       <w:r>
@@ -5785,9 +5876,9 @@
         </w:pict>
       </w:r>
     </w:p>
-    <w:bookmarkEnd w:id="40"/>
-    <w:bookmarkEnd w:id="41"/>
-    <w:bookmarkStart w:id="42" w:name="X88bbf01da0d7ef6e11341a6f0ad6b1adf849927"/>
+    <w:bookmarkEnd w:id="47"/>
+    <w:bookmarkEnd w:id="48"/>
+    <w:bookmarkStart w:id="49" w:name="X88bbf01da0d7ef6e11341a6f0ad6b1adf849927"/>
     <w:p>
       <w:pPr>
         <w:pStyle w:val="Heading2"/>
@@ -6154,8 +6245,8 @@
         </w:pict>
       </w:r>
     </w:p>
-    <w:bookmarkEnd w:id="42"/>
-    <w:bookmarkStart w:id="45" w:name="what-went-wrong-lessons-learned"/>
+    <w:bookmarkEnd w:id="49"/>
+    <w:bookmarkStart w:id="52" w:name="what-went-wrong-lessons-learned"/>
     <w:p>
       <w:pPr>
         <w:pStyle w:val="Heading2"/>
@@ -6172,7 +6263,7 @@
         <w:t xml:space="preserve">No engineering project is complete without a list of things that broke along the way.</w:t>
       </w:r>
     </w:p>
-    <w:bookmarkStart w:id="43" w:name="tracking-the-wrong-object"/>
+    <w:bookmarkStart w:id="50" w:name="tracking-the-wrong-object"/>
     <w:p>
       <w:pPr>
         <w:pStyle w:val="Heading3"/>
@@ -6189,8 +6280,8 @@
         <w:t xml:space="preserve">In early versions, the video segmentation model locked onto the wicket stumps instead of the bat in ~20% of videos. The stumps and bat are both long, thin, wooden objects. The dual-session subtraction trick (Stage 3b) solved this completely.</w:t>
       </w:r>
     </w:p>
-    <w:bookmarkEnd w:id="43"/>
-    <w:bookmarkStart w:id="44" w:name="camera-shake-corrupting-depth"/>
+    <w:bookmarkEnd w:id="50"/>
+    <w:bookmarkStart w:id="51" w:name="camera-shake-corrupting-depth"/>
     <w:p>
       <w:pPr>
         <w:pStyle w:val="Heading3"/>
@@ -6230,9 +6321,9 @@
         </w:pict>
       </w:r>
     </w:p>
-    <w:bookmarkEnd w:id="44"/>
-    <w:bookmarkEnd w:id="45"/>
-    <w:bookmarkStart w:id="46" w:name="the-power-of-zero-shot-ai"/>
+    <w:bookmarkEnd w:id="51"/>
+    <w:bookmarkEnd w:id="52"/>
+    <w:bookmarkStart w:id="53" w:name="the-power-of-zero-shot-ai"/>
     <w:p>
       <w:pPr>
         <w:pStyle w:val="Heading2"/>
@@ -6353,8 +6444,8 @@
         <w:t xml:space="preserve">By forcing these generalized models to collaborate, we achieved highly specific, 3D tracking without ever having to collect and label thousands of cricket videos for training.</w:t>
       </w:r>
     </w:p>
-    <w:bookmarkEnd w:id="46"/>
-    <w:bookmarkStart w:id="47" w:name="conclusion-beyond-cricket"/>
+    <w:bookmarkEnd w:id="53"/>
+    <w:bookmarkStart w:id="54" w:name="conclusion-beyond-cricket"/>
     <w:p>
       <w:pPr>
         <w:pStyle w:val="Heading2"/>
@@ -6387,8 +6478,8 @@
         <w:t xml:space="preserve">Ultimately, this pipeline is a blueprint for how we can use AI to pull structured 3D data out of standard 2D video, reducing our reliance on specialized hardware.</w:t>
       </w:r>
     </w:p>
-    <w:bookmarkEnd w:id="47"/>
-    <w:bookmarkStart w:id="48" w:name="references"/>
+    <w:bookmarkEnd w:id="54"/>
+    <w:bookmarkStart w:id="55" w:name="references"/>
     <w:p>
       <w:pPr>
         <w:pStyle w:val="Heading2"/>
@@ -6418,7 +6509,7 @@
         </w:numPr>
       </w:pPr>
       <w:r>
-        <w:t xml:space="preserve">Segment Anything Model 2 (SAM 2) - https://github.com/facebookresearch/segment-anything-2</w:t>
+        <w:t xml:space="preserve">Segment Anything Model 3 (SAM 3.1) - https://github.com/facebookresearch/sam3</w:t>
       </w:r>
     </w:p>
     <w:p>
@@ -6492,8 +6583,8 @@
         </w:pict>
       </w:r>
     </w:p>
-    <w:bookmarkEnd w:id="48"/>
-    <w:bookmarkEnd w:id="49"/>
+    <w:bookmarkEnd w:id="55"/>
+    <w:bookmarkEnd w:id="56"/>
     <w:sectPr/>
   </w:body>
 </w:document>

</xml_diff>

<commit_message>
Style all Mermaid edge labels with transparent theme-colored borders and fix final arrow link type
</commit_message>
<xml_diff>
--- a/blog_draft_2.docx
+++ b/blog_draft_2.docx
@@ -363,6 +363,15 @@
         <w:rPr>
           <w:rStyle w:val="VerbatimChar"/>
         </w:rPr>
+        <w:t xml:space="preserve">%%{init: {'theme': 'base', 'themeVariables': { 'edgeLabelBackground':'transparent' }}}%%</w:t>
+      </w:r>
+      <w:r>
+        <w:br/>
+      </w:r>
+      <w:r>
+        <w:rPr>
+          <w:rStyle w:val="VerbatimChar"/>
+        </w:rPr>
         <w:t xml:space="preserve">graph TD</w:t>
       </w:r>
       <w:r>
@@ -438,7 +447,7 @@
         <w:rPr>
           <w:rStyle w:val="VerbatimChar"/>
         </w:rPr>
-        <w:t xml:space="preserve">    S -- "Stable Frames" --&gt; D["Depth Maps&lt;br&gt;&lt;i&gt;Depth Estimation&lt;/i&gt;"]:::infer</w:t>
+        <w:t xml:space="preserve">    S -- "&lt;span style='background:rgba(11,15,25,0.7); border:1px solid #a855f7; color:#a855f7; padding:2px 6px; border-radius:4px; font-size:10px; font-weight:bold; display:inline-block;'&gt;Stable Frames&lt;/span&gt;" --&gt; D["Depth Maps&lt;br&gt;&lt;i&gt;Depth Estimation&lt;/i&gt;"]:::infer</w:t>
       </w:r>
       <w:r>
         <w:br/>
@@ -447,7 +456,7 @@
         <w:rPr>
           <w:rStyle w:val="VerbatimChar"/>
         </w:rPr>
-        <w:t xml:space="preserve">    S -- "Stable Frames" --&gt; Seg["Bat Mask&lt;br&gt;&lt;i&gt;Object Tracking&lt;/i&gt;"]:::infer</w:t>
+        <w:t xml:space="preserve">    S -- "&lt;span style='background:rgba(11,15,25,0.7); border:1px solid #a855f7; color:#a855f7; padding:2px 6px; border-radius:4px; font-size:10px; font-weight:bold; display:inline-block;'&gt;Stable Frames&lt;/span&gt;" --&gt; Seg["Bat Mask&lt;br&gt;&lt;i&gt;Object Tracking&lt;/i&gt;"]:::infer</w:t>
       </w:r>
       <w:r>
         <w:br/>
@@ -465,7 +474,7 @@
         <w:rPr>
           <w:rStyle w:val="VerbatimChar"/>
         </w:rPr>
-        <w:t xml:space="preserve">    D -- "Z-Depth" --&gt; K["3D Keypoints&lt;br&gt;&lt;i&gt;PCA for Bat Axis&lt;/i&gt;"]:::phys</w:t>
+        <w:t xml:space="preserve">    D -- "&lt;span style='background:rgba(11,15,25,0.7); border:1px solid #06b6d4; color:#06b6d4; padding:2px 6px; border-radius:4px; font-size:10px; font-weight:bold; display:inline-block;'&gt;Z-Depth&lt;/span&gt;" --&gt; K["3D Keypoints&lt;br&gt;&lt;i&gt;PCA for Bat Axis&lt;/i&gt;"]:::phys</w:t>
       </w:r>
       <w:r>
         <w:br/>
@@ -474,7 +483,7 @@
         <w:rPr>
           <w:rStyle w:val="VerbatimChar"/>
         </w:rPr>
-        <w:t xml:space="preserve">    Seg -- "X, Y Pixels" --&gt; K</w:t>
+        <w:t xml:space="preserve">    Seg -- "&lt;span style='background:rgba(11,15,25,0.7); border:1px solid #06b6d4; color:#06b6d4; padding:2px 6px; border-radius:4px; font-size:10px; font-weight:bold; display:inline-block;'&gt;X, Y Pixels&lt;/span&gt;" --&gt; K</w:t>
       </w:r>
       <w:r>
         <w:br/>
@@ -492,7 +501,7 @@
         <w:rPr>
           <w:rStyle w:val="VerbatimChar"/>
         </w:rPr>
-        <w:t xml:space="preserve">    K -- "Raw 3D Points" --&gt; F["3D Fusion&lt;br&gt;&lt;i&gt;Physics-based Smoothing&lt;/i&gt;"]:::phys</w:t>
+        <w:t xml:space="preserve">    K -- "&lt;span style='background:rgba(11,15,25,0.7); border:1px solid #10b981; color:#10b981; padding:2px 6px; border-radius:4px; font-size:10px; font-weight:bold; display:inline-block;'&gt;Raw 3D Points&lt;/span&gt;" --&gt; F["3D Fusion&lt;br&gt;&lt;i&gt;Physics-based Smoothing&lt;/i&gt;"]:::phys</w:t>
       </w:r>
       <w:r>
         <w:br/>
@@ -510,7 +519,7 @@
         <w:rPr>
           <w:rStyle w:val="VerbatimChar"/>
         </w:rPr>
-        <w:t xml:space="preserve">    F == "Smooth Trajectory" === R["Render Bat Swing Plane&lt;br&gt;&lt;i&gt;3D Visualization&lt;/i&gt;"]:::out</w:t>
+        <w:t xml:space="preserve">    F -- "&lt;span style='background:rgba(11,15,25,0.7); border:1px solid #f43f5e; color:#f43f5e; padding:2px 6px; border-radius:4px; font-size:10px; font-weight:bold; display:inline-block;'&gt;Smooth Trajectory&lt;/span&gt;" --&gt; R["Render Bat Swing Plane&lt;br&gt;&lt;i&gt;3D Visualization&lt;/i&gt;"]:::out</w:t>
       </w:r>
       <w:r>
         <w:br/>

</xml_diff>

<commit_message>
Fix Mermaid arrow labels: set 100% transparent backgrounds and clear colored text/borders
</commit_message>
<xml_diff>
--- a/blog_draft_2.docx
+++ b/blog_draft_2.docx
@@ -447,7 +447,7 @@
         <w:rPr>
           <w:rStyle w:val="VerbatimChar"/>
         </w:rPr>
-        <w:t xml:space="preserve">    S -- "&lt;span style='background:rgba(11,15,25,0.7); border:1px solid #a855f7; color:#a855f7; padding:2px 6px; border-radius:4px; font-size:10px; font-weight:bold; display:inline-block;'&gt;Stable Frames&lt;/span&gt;" --&gt; D["Depth Maps&lt;br&gt;&lt;i&gt;Depth Estimation&lt;/i&gt;"]:::infer</w:t>
+        <w:t xml:space="preserve">    S -- "&lt;span style='background:transparent !important; border:1.5px solid #a855f7 !important; color:#a855f7 !important; padding:2px 6px; border-radius:4px; font-size:10px; font-weight:bold; display:inline-block;'&gt;Stable Frames&lt;/span&gt;" --&gt; D["Depth Maps&lt;br&gt;&lt;i&gt;Depth Estimation&lt;/i&gt;"]:::infer</w:t>
       </w:r>
       <w:r>
         <w:br/>
@@ -456,7 +456,7 @@
         <w:rPr>
           <w:rStyle w:val="VerbatimChar"/>
         </w:rPr>
-        <w:t xml:space="preserve">    S -- "&lt;span style='background:rgba(11,15,25,0.7); border:1px solid #a855f7; color:#a855f7; padding:2px 6px; border-radius:4px; font-size:10px; font-weight:bold; display:inline-block;'&gt;Stable Frames&lt;/span&gt;" --&gt; Seg["Bat Mask&lt;br&gt;&lt;i&gt;Object Tracking&lt;/i&gt;"]:::infer</w:t>
+        <w:t xml:space="preserve">    S -- "&lt;span style='background:transparent !important; border:1.5px solid #a855f7 !important; color:#a855f7 !important; padding:2px 6px; border-radius:4px; font-size:10px; font-weight:bold; display:inline-block;'&gt;Stable Frames&lt;/span&gt;" --&gt; Seg["Bat Mask&lt;br&gt;&lt;i&gt;Object Tracking&lt;/i&gt;"]:::infer</w:t>
       </w:r>
       <w:r>
         <w:br/>
@@ -474,7 +474,7 @@
         <w:rPr>
           <w:rStyle w:val="VerbatimChar"/>
         </w:rPr>
-        <w:t xml:space="preserve">    D -- "&lt;span style='background:rgba(11,15,25,0.7); border:1px solid #06b6d4; color:#06b6d4; padding:2px 6px; border-radius:4px; font-size:10px; font-weight:bold; display:inline-block;'&gt;Z-Depth&lt;/span&gt;" --&gt; K["3D Keypoints&lt;br&gt;&lt;i&gt;PCA for Bat Axis&lt;/i&gt;"]:::phys</w:t>
+        <w:t xml:space="preserve">    D -- "&lt;span style='background:transparent !important; border:1.5px solid #06b6d4 !important; color:#06b6d4 !important; padding:2px 6px; border-radius:4px; font-size:10px; font-weight:bold; display:inline-block;'&gt;Z-Depth&lt;/span&gt;" --&gt; K["3D Keypoints&lt;br&gt;&lt;i&gt;PCA for Bat Axis&lt;/i&gt;"]:::phys</w:t>
       </w:r>
       <w:r>
         <w:br/>
@@ -483,7 +483,7 @@
         <w:rPr>
           <w:rStyle w:val="VerbatimChar"/>
         </w:rPr>
-        <w:t xml:space="preserve">    Seg -- "&lt;span style='background:rgba(11,15,25,0.7); border:1px solid #06b6d4; color:#06b6d4; padding:2px 6px; border-radius:4px; font-size:10px; font-weight:bold; display:inline-block;'&gt;X, Y Pixels&lt;/span&gt;" --&gt; K</w:t>
+        <w:t xml:space="preserve">    Seg -- "&lt;span style='background:transparent !important; border:1.5px solid #06b6d4 !important; color:#06b6d4 !important; padding:2px 6px; border-radius:4px; font-size:10px; font-weight:bold; display:inline-block;'&gt;X, Y Pixels&lt;/span&gt;" --&gt; K</w:t>
       </w:r>
       <w:r>
         <w:br/>
@@ -501,7 +501,7 @@
         <w:rPr>
           <w:rStyle w:val="VerbatimChar"/>
         </w:rPr>
-        <w:t xml:space="preserve">    K -- "&lt;span style='background:rgba(11,15,25,0.7); border:1px solid #10b981; color:#10b981; padding:2px 6px; border-radius:4px; font-size:10px; font-weight:bold; display:inline-block;'&gt;Raw 3D Points&lt;/span&gt;" --&gt; F["3D Fusion&lt;br&gt;&lt;i&gt;Physics-based Smoothing&lt;/i&gt;"]:::phys</w:t>
+        <w:t xml:space="preserve">    K -- "&lt;span style='background:transparent !important; border:1.5px solid #10b981 !important; color:#10b981 !important; padding:2px 6px; border-radius:4px; font-size:10px; font-weight:bold; display:inline-block;'&gt;Raw 3D Points&lt;/span&gt;" --&gt; F["3D Fusion&lt;br&gt;&lt;i&gt;Physics-based Smoothing&lt;/i&gt;"]:::phys</w:t>
       </w:r>
       <w:r>
         <w:br/>
@@ -519,7 +519,7 @@
         <w:rPr>
           <w:rStyle w:val="VerbatimChar"/>
         </w:rPr>
-        <w:t xml:space="preserve">    F -- "&lt;span style='background:rgba(11,15,25,0.7); border:1px solid #f43f5e; color:#f43f5e; padding:2px 6px; border-radius:4px; font-size:10px; font-weight:bold; display:inline-block;'&gt;Smooth Trajectory&lt;/span&gt;" --&gt; R["Render Bat Swing Plane&lt;br&gt;&lt;i&gt;3D Visualization&lt;/i&gt;"]:::out</w:t>
+        <w:t xml:space="preserve">    F -- "&lt;span style='background:transparent !important; border:1.5px solid #f43f5e !important; color:#f43f5e !important; padding:2px 6px; border-radius:4px; font-size:10px; font-weight:bold; display:inline-block;'&gt;Smooth Trajectory&lt;/span&gt;" --&gt; R["Render Bat Swing Plane&lt;br&gt;&lt;i&gt;3D Visualization&lt;/i&gt;"]:::out</w:t>
       </w:r>
       <w:r>
         <w:br/>

</xml_diff>